<commit_message>
agregar renderizado de documentos
</commit_message>
<xml_diff>
--- a/docs/DSWB_Entrega_Final_TechRetail_1C2026_final.docx
+++ b/docs/DSWB_Entrega_Final_TechRetail_1C2026_final.docx
@@ -1,38 +1,5 @@
 
-<file path=docProps\app.xml><?xml version="1.0" encoding="utf-8"?>
-<Properties xmlns="http://schemas.openxmlformats.org/officeDocument/2006/extended-properties" xmlns:vt="http://schemas.openxmlformats.org/officeDocument/2006/docPropsVTypes">
-  <Template>Normal.dotm</Template>
-  <TotalTime>9</TotalTime>
-  <Pages>1</Pages>
-  <Words>2030</Words>
-  <Characters>11170</Characters>
-  <Application>Microsoft Office Word</Application>
-  <DocSecurity>0</DocSecurity>
-  <Lines>93</Lines>
-  <Paragraphs>26</Paragraphs>
-  <ScaleCrop>false</ScaleCrop>
-  <Company/>
-  <LinksUpToDate>false</LinksUpToDate>
-  <CharactersWithSpaces>13174</CharactersWithSpaces>
-  <SharedDoc>false</SharedDoc>
-  <HyperlinksChanged>false</HyperlinksChanged>
-  <AppVersion>16.0000</AppVersion>
-</Properties>
-</file>
-
-<file path=docProps\core.xml><?xml version="1.0" encoding="utf-8"?>
-<cp:coreProperties xmlns:cp="http://schemas.openxmlformats.org/package/2006/metadata/core-properties" xmlns:dc="http://purl.org/dc/elements/1.1/" xmlns:dcterms="http://purl.org/dc/terms/" xmlns:dcmitype="http://purl.org/dc/dcmitype/" xmlns:xsi="http://www.w3.org/2001/XMLSchema-instance">
-  <dc:title>Documentacion Entrega Final - TechRetail Solutions S.R.L.</dc:title>
-  <dc:creator>TechRetail Solutions S.R.L.</dc:creator>
-  <dc:description>Documentacion tecnica actualizada para Entrega Final de Desarrollo Web Backend.</dc:description>
-  <cp:lastModifiedBy>Leandro Melchiori</cp:lastModifiedBy>
-  <cp:revision>3</cp:revision>
-  <dcterms:created xsi:type="dcterms:W3CDTF">2026-06-27T23:16:00Z</dcterms:created>
-  <dcterms:modified xsi:type="dcterms:W3CDTF">2026-06-27T23:45:00Z</dcterms:modified>
-</cp:coreProperties>
-</file>
-
-<file path=word\document.xml><?xml version="1.0" encoding="utf-8"?>
+<file path=word/document.xml><?xml version="1.0" encoding="utf-8"?>
 <w:document xmlns:wpc="http://schemas.microsoft.com/office/word/2010/wordprocessingCanvas" xmlns:cx="http://schemas.microsoft.com/office/drawing/2014/chartex" xmlns:cx1="http://schemas.microsoft.com/office/drawing/2015/9/8/chartex" xmlns:cx2="http://schemas.microsoft.com/office/drawing/2015/10/21/chartex" xmlns:cx3="http://schemas.microsoft.com/office/drawing/2016/5/9/chartex" xmlns:cx4="http://schemas.microsoft.com/office/drawing/2016/5/10/chartex" xmlns:cx5="http://schemas.microsoft.com/office/drawing/2016/5/11/chartex" xmlns:cx6="http://schemas.microsoft.com/office/drawing/2016/5/12/chartex" xmlns:cx7="http://schemas.microsoft.com/office/drawing/2016/5/13/chartex" xmlns:cx8="http://schemas.microsoft.com/office/drawing/2016/5/14/chartex" xmlns:mc="http://schemas.openxmlformats.org/markup-compatibility/2006" xmlns:aink="http://schemas.microsoft.com/office/drawing/2016/ink" xmlns:am3d="http://schemas.microsoft.com/office/drawing/2017/model3d" xmlns:o="urn:schemas-microsoft-com:office:office" xmlns:oel="http://schemas.microsoft.com/office/2019/extlst" xmlns:r="http://schemas.openxmlformats.org/officeDocument/2006/relationships" xmlns:m="http://schemas.openxmlformats.org/officeDocument/2006/math" xmlns:v="urn:schemas-microsoft-com:vml" xmlns:wp14="http://schemas.microsoft.com/office/word/2010/wordprocessingDrawing" xmlns:wp="http://schemas.openxmlformats.org/drawingml/2006/wordprocessingDrawing" xmlns:w10="urn:schemas-microsoft-com:office:word" xmlns:w="http://schemas.openxmlformats.org/wordprocessingml/2006/main" xmlns:w14="http://schemas.microsoft.com/office/word/2010/wordml" xmlns:w15="http://schemas.microsoft.com/office/word/2012/wordml" xmlns:w16cex="http://schemas.microsoft.com/office/word/2018/wordml/cex" xmlns:w16cid="http://schemas.microsoft.com/office/word/2016/wordml/cid" xmlns:w16="http://schemas.microsoft.com/office/word/2018/wordml" xmlns:w16du="http://schemas.microsoft.com/office/word/2023/wordml/word16du" xmlns:w16sdtdh="http://schemas.microsoft.com/office/word/2020/wordml/sdtdatahash" xmlns:w16sdtfl="http://schemas.microsoft.com/office/word/2024/wordml/sdtformatlock" xmlns:w16se="http://schemas.microsoft.com/office/word/2015/wordml/symex" xmlns:wpg="http://schemas.microsoft.com/office/word/2010/wordprocessingGroup" xmlns:wpi="http://schemas.microsoft.com/office/word/2010/wordprocessingInk" xmlns:wne="http://schemas.microsoft.com/office/word/2006/wordml" xmlns:wps="http://schemas.microsoft.com/office/word/2010/wordprocessingShape" mc:Ignorable="w14 w15 w16se w16cid w16 w16cex w16sdtdh w16sdtfl w16du wp14">
   <w:body>
     <w:p>
@@ -5555,7 +5522,7 @@
 </w:document>
 </file>
 
-<file path=word\endnotes.xml><?xml version="1.0" encoding="utf-8"?>
+<file path=word/endnotes.xml><?xml version="1.0" encoding="utf-8"?>
 <w:endnotes xmlns:wpc="http://schemas.microsoft.com/office/word/2010/wordprocessingCanvas" xmlns:cx="http://schemas.microsoft.com/office/drawing/2014/chartex" xmlns:cx1="http://schemas.microsoft.com/office/drawing/2015/9/8/chartex" xmlns:cx2="http://schemas.microsoft.com/office/drawing/2015/10/21/chartex" xmlns:cx3="http://schemas.microsoft.com/office/drawing/2016/5/9/chartex" xmlns:cx4="http://schemas.microsoft.com/office/drawing/2016/5/10/chartex" xmlns:cx5="http://schemas.microsoft.com/office/drawing/2016/5/11/chartex" xmlns:cx6="http://schemas.microsoft.com/office/drawing/2016/5/12/chartex" xmlns:cx7="http://schemas.microsoft.com/office/drawing/2016/5/13/chartex" xmlns:cx8="http://schemas.microsoft.com/office/drawing/2016/5/14/chartex" xmlns:mc="http://schemas.openxmlformats.org/markup-compatibility/2006" xmlns:aink="http://schemas.microsoft.com/office/drawing/2016/ink" xmlns:am3d="http://schemas.microsoft.com/office/drawing/2017/model3d" xmlns:o="urn:schemas-microsoft-com:office:office" xmlns:oel="http://schemas.microsoft.com/office/2019/extlst" xmlns:r="http://schemas.openxmlformats.org/officeDocument/2006/relationships" xmlns:m="http://schemas.openxmlformats.org/officeDocument/2006/math" xmlns:v="urn:schemas-microsoft-com:vml" xmlns:wp14="http://schemas.microsoft.com/office/word/2010/wordprocessingDrawing" xmlns:wp="http://schemas.openxmlformats.org/drawingml/2006/wordprocessingDrawing" xmlns:w10="urn:schemas-microsoft-com:office:word" xmlns:w="http://schemas.openxmlformats.org/wordprocessingml/2006/main" xmlns:w14="http://schemas.microsoft.com/office/word/2010/wordml" xmlns:w15="http://schemas.microsoft.com/office/word/2012/wordml" xmlns:w16cex="http://schemas.microsoft.com/office/word/2018/wordml/cex" xmlns:w16cid="http://schemas.microsoft.com/office/word/2016/wordml/cid" xmlns:w16="http://schemas.microsoft.com/office/word/2018/wordml" xmlns:w16du="http://schemas.microsoft.com/office/word/2023/wordml/word16du" xmlns:w16sdtdh="http://schemas.microsoft.com/office/word/2020/wordml/sdtdatahash" xmlns:w16sdtfl="http://schemas.microsoft.com/office/word/2024/wordml/sdtformatlock" xmlns:w16se="http://schemas.microsoft.com/office/word/2015/wordml/symex" xmlns:wpg="http://schemas.microsoft.com/office/word/2010/wordprocessingGroup" xmlns:wpi="http://schemas.microsoft.com/office/word/2010/wordprocessingInk" xmlns:wne="http://schemas.microsoft.com/office/word/2006/wordml" xmlns:wps="http://schemas.microsoft.com/office/word/2010/wordprocessingShape" mc:Ignorable="w14 w15 w16se w16cid w16 w16cex w16sdtdh w16sdtfl w16du wp14">
   <w:endnote w:type="separator" w:id="-1">
     <w:p>
@@ -5580,45 +5547,7 @@
 </w:endnotes>
 </file>
 
-<file path=word\fontTable.xml><?xml version="1.0" encoding="utf-8"?>
-<w:fonts xmlns:mc="http://schemas.openxmlformats.org/markup-compatibility/2006" xmlns:r="http://schemas.openxmlformats.org/officeDocument/2006/relationships" xmlns:w="http://schemas.openxmlformats.org/wordprocessingml/2006/main" xmlns:w14="http://schemas.microsoft.com/office/word/2010/wordml" xmlns:w15="http://schemas.microsoft.com/office/word/2012/wordml" xmlns:w16cex="http://schemas.microsoft.com/office/word/2018/wordml/cex" xmlns:w16cid="http://schemas.microsoft.com/office/word/2016/wordml/cid" xmlns:w16="http://schemas.microsoft.com/office/word/2018/wordml" xmlns:w16du="http://schemas.microsoft.com/office/word/2023/wordml/word16du" xmlns:w16sdtdh="http://schemas.microsoft.com/office/word/2020/wordml/sdtdatahash" xmlns:w16sdtfl="http://schemas.microsoft.com/office/word/2024/wordml/sdtformatlock" xmlns:w16se="http://schemas.microsoft.com/office/word/2015/wordml/symex" mc:Ignorable="w14 w15 w16se w16cid w16 w16cex w16sdtdh w16sdtfl w16du">
-  <w:font w:name="Arial">
-    <w:panose1 w:val="020B0604020202020204"/>
-    <w:charset w:val="00"/>
-    <w:family w:val="swiss"/>
-    <w:pitch w:val="variable"/>
-    <w:sig w:usb0="E0002EFF" w:usb1="C000785B" w:usb2="00000009" w:usb3="00000000" w:csb0="000001FF" w:csb1="00000000"/>
-  </w:font>
-  <w:font w:name="Times New Roman">
-    <w:panose1 w:val="02020603050405020304"/>
-    <w:charset w:val="00"/>
-    <w:family w:val="roman"/>
-    <w:pitch w:val="variable"/>
-    <w:sig w:usb0="E0002EFF" w:usb1="C000785B" w:usb2="00000009" w:usb3="00000000" w:csb0="000001FF" w:csb1="00000000"/>
-  </w:font>
-  <w:font w:name="Consolas">
-    <w:panose1 w:val="020B0609020204030204"/>
-    <w:charset w:val="00"/>
-    <w:family w:val="modern"/>
-    <w:pitch w:val="fixed"/>
-    <w:sig w:usb0="E00006FF" w:usb1="0000FCFF" w:usb2="00000001" w:usb3="00000000" w:csb0="0000019F" w:csb1="00000000"/>
-  </w:font>
-  <w:font w:name="Aptos Display">
-    <w:charset w:val="00"/>
-    <w:family w:val="swiss"/>
-    <w:pitch w:val="variable"/>
-    <w:sig w:usb0="20000287" w:usb1="00000003" w:usb2="00000000" w:usb3="00000000" w:csb0="0000019F" w:csb1="00000000"/>
-  </w:font>
-  <w:font w:name="Aptos">
-    <w:charset w:val="00"/>
-    <w:family w:val="swiss"/>
-    <w:pitch w:val="variable"/>
-    <w:sig w:usb0="20000287" w:usb1="00000003" w:usb2="00000000" w:usb3="00000000" w:csb0="0000019F" w:csb1="00000000"/>
-  </w:font>
-</w:fonts>
-</file>
-
-<file path=word\footer1.xml><?xml version="1.0" encoding="utf-8"?>
+<file path=word/footer1.xml><?xml version="1.0" encoding="utf-8"?>
 <w:ftr xmlns:wpc="http://schemas.microsoft.com/office/word/2010/wordprocessingCanvas" xmlns:cx="http://schemas.microsoft.com/office/drawing/2014/chartex" xmlns:cx1="http://schemas.microsoft.com/office/drawing/2015/9/8/chartex" xmlns:cx2="http://schemas.microsoft.com/office/drawing/2015/10/21/chartex" xmlns:cx3="http://schemas.microsoft.com/office/drawing/2016/5/9/chartex" xmlns:cx4="http://schemas.microsoft.com/office/drawing/2016/5/10/chartex" xmlns:cx5="http://schemas.microsoft.com/office/drawing/2016/5/11/chartex" xmlns:cx6="http://schemas.microsoft.com/office/drawing/2016/5/12/chartex" xmlns:cx7="http://schemas.microsoft.com/office/drawing/2016/5/13/chartex" xmlns:cx8="http://schemas.microsoft.com/office/drawing/2016/5/14/chartex" xmlns:mc="http://schemas.openxmlformats.org/markup-compatibility/2006" xmlns:aink="http://schemas.microsoft.com/office/drawing/2016/ink" xmlns:am3d="http://schemas.microsoft.com/office/drawing/2017/model3d" xmlns:o="urn:schemas-microsoft-com:office:office" xmlns:oel="http://schemas.microsoft.com/office/2019/extlst" xmlns:r="http://schemas.openxmlformats.org/officeDocument/2006/relationships" xmlns:m="http://schemas.openxmlformats.org/officeDocument/2006/math" xmlns:v="urn:schemas-microsoft-com:vml" xmlns:wp14="http://schemas.microsoft.com/office/word/2010/wordprocessingDrawing" xmlns:wp="http://schemas.openxmlformats.org/drawingml/2006/wordprocessingDrawing" xmlns:w10="urn:schemas-microsoft-com:office:word" xmlns:w="http://schemas.openxmlformats.org/wordprocessingml/2006/main" xmlns:w14="http://schemas.microsoft.com/office/word/2010/wordml" xmlns:w15="http://schemas.microsoft.com/office/word/2012/wordml" xmlns:w16cex="http://schemas.microsoft.com/office/word/2018/wordml/cex" xmlns:w16cid="http://schemas.microsoft.com/office/word/2016/wordml/cid" xmlns:w16="http://schemas.microsoft.com/office/word/2018/wordml" xmlns:w16du="http://schemas.microsoft.com/office/word/2023/wordml/word16du" xmlns:w16sdtdh="http://schemas.microsoft.com/office/word/2020/wordml/sdtdatahash" xmlns:w16sdtfl="http://schemas.microsoft.com/office/word/2024/wordml/sdtformatlock" xmlns:w16se="http://schemas.microsoft.com/office/word/2015/wordml/symex" xmlns:wpg="http://schemas.microsoft.com/office/word/2010/wordprocessingGroup" xmlns:wpi="http://schemas.microsoft.com/office/word/2010/wordprocessingInk" xmlns:wne="http://schemas.microsoft.com/office/word/2006/wordml" xmlns:wps="http://schemas.microsoft.com/office/word/2010/wordprocessingShape" mc:Ignorable="w14 w15 w16se w16cid w16 w16cex w16sdtdh w16sdtfl w16du wp14">
   <w:p>
     <w:pPr>
@@ -5677,7 +5606,7 @@
 </w:ftr>
 </file>
 
-<file path=word\footnotes.xml><?xml version="1.0" encoding="utf-8"?>
+<file path=word/footnotes.xml><?xml version="1.0" encoding="utf-8"?>
 <w:footnotes xmlns:wpc="http://schemas.microsoft.com/office/word/2010/wordprocessingCanvas" xmlns:cx="http://schemas.microsoft.com/office/drawing/2014/chartex" xmlns:cx1="http://schemas.microsoft.com/office/drawing/2015/9/8/chartex" xmlns:cx2="http://schemas.microsoft.com/office/drawing/2015/10/21/chartex" xmlns:cx3="http://schemas.microsoft.com/office/drawing/2016/5/9/chartex" xmlns:cx4="http://schemas.microsoft.com/office/drawing/2016/5/10/chartex" xmlns:cx5="http://schemas.microsoft.com/office/drawing/2016/5/11/chartex" xmlns:cx6="http://schemas.microsoft.com/office/drawing/2016/5/12/chartex" xmlns:cx7="http://schemas.microsoft.com/office/drawing/2016/5/13/chartex" xmlns:cx8="http://schemas.microsoft.com/office/drawing/2016/5/14/chartex" xmlns:mc="http://schemas.openxmlformats.org/markup-compatibility/2006" xmlns:aink="http://schemas.microsoft.com/office/drawing/2016/ink" xmlns:am3d="http://schemas.microsoft.com/office/drawing/2017/model3d" xmlns:o="urn:schemas-microsoft-com:office:office" xmlns:oel="http://schemas.microsoft.com/office/2019/extlst" xmlns:r="http://schemas.openxmlformats.org/officeDocument/2006/relationships" xmlns:m="http://schemas.openxmlformats.org/officeDocument/2006/math" xmlns:v="urn:schemas-microsoft-com:vml" xmlns:wp14="http://schemas.microsoft.com/office/word/2010/wordprocessingDrawing" xmlns:wp="http://schemas.openxmlformats.org/drawingml/2006/wordprocessingDrawing" xmlns:w10="urn:schemas-microsoft-com:office:word" xmlns:w="http://schemas.openxmlformats.org/wordprocessingml/2006/main" xmlns:w14="http://schemas.microsoft.com/office/word/2010/wordml" xmlns:w15="http://schemas.microsoft.com/office/word/2012/wordml" xmlns:w16cex="http://schemas.microsoft.com/office/word/2018/wordml/cex" xmlns:w16cid="http://schemas.microsoft.com/office/word/2016/wordml/cid" xmlns:w16="http://schemas.microsoft.com/office/word/2018/wordml" xmlns:w16du="http://schemas.microsoft.com/office/word/2023/wordml/word16du" xmlns:w16sdtdh="http://schemas.microsoft.com/office/word/2020/wordml/sdtdatahash" xmlns:w16sdtfl="http://schemas.microsoft.com/office/word/2024/wordml/sdtformatlock" xmlns:w16se="http://schemas.microsoft.com/office/word/2015/wordml/symex" xmlns:wpg="http://schemas.microsoft.com/office/word/2010/wordprocessingGroup" xmlns:wpi="http://schemas.microsoft.com/office/word/2010/wordprocessingInk" xmlns:wne="http://schemas.microsoft.com/office/word/2006/wordml" xmlns:wps="http://schemas.microsoft.com/office/word/2010/wordprocessingShape" mc:Ignorable="w14 w15 w16se w16cid w16 w16cex w16sdtdh w16sdtfl w16du wp14">
   <w:footnote w:type="separator" w:id="-1">
     <w:p>
@@ -5702,7 +5631,7 @@
 </w:footnotes>
 </file>
 
-<file path=word\numbering.xml><?xml version="1.0" encoding="utf-8"?>
+<file path=word/numbering.xml><?xml version="1.0" encoding="utf-8"?>
 <w:numbering xmlns:wpc="http://schemas.microsoft.com/office/word/2010/wordprocessingCanvas" xmlns:cx="http://schemas.microsoft.com/office/drawing/2014/chartex" xmlns:cx1="http://schemas.microsoft.com/office/drawing/2015/9/8/chartex" xmlns:cx2="http://schemas.microsoft.com/office/drawing/2015/10/21/chartex" xmlns:cx3="http://schemas.microsoft.com/office/drawing/2016/5/9/chartex" xmlns:cx4="http://schemas.microsoft.com/office/drawing/2016/5/10/chartex" xmlns:cx5="http://schemas.microsoft.com/office/drawing/2016/5/11/chartex" xmlns:cx6="http://schemas.microsoft.com/office/drawing/2016/5/12/chartex" xmlns:cx7="http://schemas.microsoft.com/office/drawing/2016/5/13/chartex" xmlns:cx8="http://schemas.microsoft.com/office/drawing/2016/5/14/chartex" xmlns:mc="http://schemas.openxmlformats.org/markup-compatibility/2006" xmlns:aink="http://schemas.microsoft.com/office/drawing/2016/ink" xmlns:am3d="http://schemas.microsoft.com/office/drawing/2017/model3d" xmlns:o="urn:schemas-microsoft-com:office:office" xmlns:oel="http://schemas.microsoft.com/office/2019/extlst" xmlns:r="http://schemas.openxmlformats.org/officeDocument/2006/relationships" xmlns:m="http://schemas.openxmlformats.org/officeDocument/2006/math" xmlns:v="urn:schemas-microsoft-com:vml" xmlns:wp14="http://schemas.microsoft.com/office/word/2010/wordprocessingDrawing" xmlns:wp="http://schemas.openxmlformats.org/drawingml/2006/wordprocessingDrawing" xmlns:w10="urn:schemas-microsoft-com:office:word" xmlns:w="http://schemas.openxmlformats.org/wordprocessingml/2006/main" xmlns:w14="http://schemas.microsoft.com/office/word/2010/wordml" xmlns:w15="http://schemas.microsoft.com/office/word/2012/wordml" xmlns:w16cex="http://schemas.microsoft.com/office/word/2018/wordml/cex" xmlns:w16cid="http://schemas.microsoft.com/office/word/2016/wordml/cid" xmlns:w16="http://schemas.microsoft.com/office/word/2018/wordml" xmlns:w16du="http://schemas.microsoft.com/office/word/2023/wordml/word16du" xmlns:w16sdtdh="http://schemas.microsoft.com/office/word/2020/wordml/sdtdatahash" xmlns:w16sdtfl="http://schemas.microsoft.com/office/word/2024/wordml/sdtformatlock" xmlns:w16se="http://schemas.microsoft.com/office/word/2015/wordml/symex" xmlns:wpg="http://schemas.microsoft.com/office/word/2010/wordprocessingGroup" xmlns:wpi="http://schemas.microsoft.com/office/word/2010/wordprocessingInk" xmlns:wne="http://schemas.microsoft.com/office/word/2006/wordml" xmlns:wps="http://schemas.microsoft.com/office/word/2010/wordprocessingShape" mc:Ignorable="w14 w15 w16se w16cid w16 w16cex w16sdtdh w16sdtfl w16du wp14">
   <w:abstractNum w:abstractNumId="0" w15:restartNumberingAfterBreak="0">
     <w:nsid w:val="06B32509"/>
@@ -5853,66 +5782,7 @@
 </w:numbering>
 </file>
 
-<file path=word\settings.xml><?xml version="1.0" encoding="utf-8"?>
-<w:settings xmlns:mc="http://schemas.openxmlformats.org/markup-compatibility/2006" xmlns:o="urn:schemas-microsoft-com:office:office" xmlns:r="http://schemas.openxmlformats.org/officeDocument/2006/relationships" xmlns:m="http://schemas.openxmlformats.org/officeDocument/2006/math" xmlns:v="urn:schemas-microsoft-com:vml" xmlns:w10="urn:schemas-microsoft-com:office:word" xmlns:w="http://schemas.openxmlformats.org/wordprocessingml/2006/main" xmlns:w14="http://schemas.microsoft.com/office/word/2010/wordml" xmlns:w15="http://schemas.microsoft.com/office/word/2012/wordml" xmlns:w16cex="http://schemas.microsoft.com/office/word/2018/wordml/cex" xmlns:w16cid="http://schemas.microsoft.com/office/word/2016/wordml/cid" xmlns:w16="http://schemas.microsoft.com/office/word/2018/wordml" xmlns:w16du="http://schemas.microsoft.com/office/word/2023/wordml/word16du" xmlns:w16sdtdh="http://schemas.microsoft.com/office/word/2020/wordml/sdtdatahash" xmlns:w16sdtfl="http://schemas.microsoft.com/office/word/2024/wordml/sdtformatlock" xmlns:w16se="http://schemas.microsoft.com/office/word/2015/wordml/symex" xmlns:sl="http://schemas.openxmlformats.org/schemaLibrary/2006/main" mc:Ignorable="w14 w15 w16se w16cid w16 w16cex w16sdtdh w16sdtfl w16du">
-  <w:zoom w:percent="100"/>
-  <w:displayBackgroundShape/>
-  <w:proofState w:spelling="clean" w:grammar="clean"/>
-  <w:defaultTabStop w:val="708"/>
-  <w:hyphenationZone w:val="425"/>
-  <w:characterSpacingControl w:val="doNotCompress"/>
-  <w:footnotePr>
-    <w:footnote w:id="-1"/>
-    <w:footnote w:id="0"/>
-  </w:footnotePr>
-  <w:endnotePr>
-    <w:endnote w:id="-1"/>
-    <w:endnote w:id="0"/>
-  </w:endnotePr>
-  <w:compat>
-    <w:compatSetting w:name="compatibilityMode" w:uri="http://schemas.microsoft.com/office/word" w:val="15"/>
-    <w:compatSetting w:name="overrideTableStyleFontSizeAndJustification" w:uri="http://schemas.microsoft.com/office/word" w:val="1"/>
-    <w:compatSetting w:name="enableOpenTypeFeatures" w:uri="http://schemas.microsoft.com/office/word" w:val="1"/>
-    <w:compatSetting w:name="doNotFlipMirrorIndents" w:uri="http://schemas.microsoft.com/office/word" w:val="1"/>
-    <w:compatSetting w:name="differentiateMultirowTableHeaders" w:uri="http://schemas.microsoft.com/office/word" w:val="1"/>
-    <w:compatSetting w:name="useWord2013TrackBottomHyphenation" w:uri="http://schemas.microsoft.com/office/word" w:val="1"/>
-  </w:compat>
-  <w:rsids>
-    <w:rsidRoot w:val="00C26022"/>
-    <w:rsid w:val="00590149"/>
-    <w:rsid w:val="00C26022"/>
-    <w:rsid w:val="00C9788D"/>
-    <w:rsid w:val="00ED5329"/>
-  </w:rsids>
-  <m:mathPr>
-    <m:mathFont m:val="Cambria Math"/>
-    <m:brkBin m:val="before"/>
-    <m:brkBinSub m:val="--"/>
-    <m:smallFrac m:val="0"/>
-    <m:dispDef/>
-    <m:lMargin m:val="0"/>
-    <m:rMargin m:val="0"/>
-    <m:defJc m:val="centerGroup"/>
-    <m:wrapIndent m:val="1440"/>
-    <m:intLim m:val="subSup"/>
-    <m:naryLim m:val="undOvr"/>
-  </m:mathPr>
-  <w:themeFontLang w:val="es-AR"/>
-  <w:clrSchemeMapping w:bg1="light1" w:t1="dark1" w:bg2="light2" w:t2="dark2" w:accent1="accent1" w:accent2="accent2" w:accent3="accent3" w:accent4="accent4" w:accent5="accent5" w:accent6="accent6" w:hyperlink="hyperlink" w:followedHyperlink="followedHyperlink"/>
-  <w:shapeDefaults>
-    <o:shapedefaults v:ext="edit" spidmax="1026"/>
-    <o:shapelayout v:ext="edit">
-      <o:idmap v:ext="edit" data="1"/>
-    </o:shapelayout>
-  </w:shapeDefaults>
-  <w:decimalSymbol w:val="."/>
-  <w:listSeparator w:val=","/>
-  <w14:docId w14:val="5CD065EB"/>
-  <w15:docId w15:val="{860DB4B6-F637-47BC-9762-5A2B9502748B}"/>
-</w:settings>
-</file>
-
-<file path=word\styles.xml><?xml version="1.0" encoding="utf-8"?>
+<file path=word/styles.xml><?xml version="1.0" encoding="utf-8"?>
 <w:styles xmlns:mc="http://schemas.openxmlformats.org/markup-compatibility/2006" xmlns:r="http://schemas.openxmlformats.org/officeDocument/2006/relationships" xmlns:w="http://schemas.openxmlformats.org/wordprocessingml/2006/main" xmlns:w14="http://schemas.microsoft.com/office/word/2010/wordml" xmlns:w15="http://schemas.microsoft.com/office/word/2012/wordml" xmlns:w16cex="http://schemas.microsoft.com/office/word/2018/wordml/cex" xmlns:w16cid="http://schemas.microsoft.com/office/word/2016/wordml/cid" xmlns:w16="http://schemas.microsoft.com/office/word/2018/wordml" xmlns:w16du="http://schemas.microsoft.com/office/word/2023/wordml/word16du" xmlns:w16sdtdh="http://schemas.microsoft.com/office/word/2020/wordml/sdtdatahash" xmlns:w16sdtfl="http://schemas.microsoft.com/office/word/2024/wordml/sdtformatlock" xmlns:w16se="http://schemas.microsoft.com/office/word/2015/wordml/symex" mc:Ignorable="w14 w15 w16se w16cid w16 w16cex w16sdtdh w16sdtfl w16du">
   <w:docDefaults>
     <w:rPrDefault>
@@ -6535,7 +6405,7 @@
 </w:styles>
 </file>
 
-<file path=word\theme\theme1.xml><?xml version="1.0" encoding="utf-8"?>
+<file path=word/theme/theme1.xml><?xml version="1.0" encoding="utf-8"?>
 <a:theme xmlns:a="http://schemas.openxmlformats.org/drawingml/2006/main" name="Tema de Office">
   <a:themeElements>
     <a:clrScheme name="Office">
@@ -6848,11 +6718,4 @@
     </a:ext>
   </a:extLst>
 </a:theme>
-</file>
-
-<file path=word\webSettings.xml><?xml version="1.0" encoding="utf-8"?>
-<w:webSettings xmlns:mc="http://schemas.openxmlformats.org/markup-compatibility/2006" xmlns:r="http://schemas.openxmlformats.org/officeDocument/2006/relationships" xmlns:w="http://schemas.openxmlformats.org/wordprocessingml/2006/main" xmlns:w14="http://schemas.microsoft.com/office/word/2010/wordml" xmlns:w15="http://schemas.microsoft.com/office/word/2012/wordml" xmlns:w16cex="http://schemas.microsoft.com/office/word/2018/wordml/cex" xmlns:w16cid="http://schemas.microsoft.com/office/word/2016/wordml/cid" xmlns:w16="http://schemas.microsoft.com/office/word/2018/wordml" xmlns:w16du="http://schemas.microsoft.com/office/word/2023/wordml/word16du" xmlns:w16sdtdh="http://schemas.microsoft.com/office/word/2020/wordml/sdtdatahash" xmlns:w16sdtfl="http://schemas.microsoft.com/office/word/2024/wordml/sdtformatlock" xmlns:w16se="http://schemas.microsoft.com/office/word/2015/wordml/symex" mc:Ignorable="w14 w15 w16se w16cid w16 w16cex w16sdtdh w16sdtfl w16du">
-  <w:relyOnVML/>
-  <w:allowPNG/>
-</w:webSettings>
 </file>
</xml_diff>